<commit_message>
Complete final CRST reproducibility and packaging audit
Co-Authored-By: Tatsuki Onishi <bougtoir@gmail.com>
</commit_message>
<xml_diff>
--- a/manuscript/build/cover_letter.docx
+++ b/manuscript/build/cover_letter.docx
@@ -19,12 +19,12 @@
     </w:p>
     <w:p>
       <w:r>
-        <w:t>Please consider our manuscript, "Functionally graded roofs for passive snow management: a reduced-order multiobjective modeling study," as a Research Article in Cold Regions Science and Technology.</w:t>
+        <w:t>Please consider my manuscript, "Functionally graded roofs for passive snow management: a reduced-order multiobjective modeling study," as a Research Article in Cold Regions Science and Technology.</w:t>
       </w:r>
     </w:p>
     <w:p>
       <w:r>
-        <w:t>The manuscript presents a reproducible reduced-order comparison of optimized spatially uniform and functionally graded passive roof-snow strategies. It maps the complete retained-mass versus discrete-release trade-off, includes geometry and surface ablations, convergence, sensitivity, Monte Carlo perturbation, manufacturing-complexity analysis, and supplementary scenarios from official Japanese weather observations.</w:t>
+        <w:t>The manuscript presents a reproducible reduced-order comparison of optimized spatially uniform and functionally graded passive roof-snow strategies. It maps the retained-mass versus discrete-release trade-off, includes geometry and surface ablations, convergence, sensitivity, Monte Carlo perturbation, manufacturing-complexity analysis, and supplementary scenarios from official Japanese weather observations.</w:t>
       </w:r>
     </w:p>
     <w:p>
@@ -39,7 +39,7 @@
     </w:p>
     <w:p>
       <w:r>
-        <w:t>All source code, public-data snapshots, checksum ledgers, and generated analysis artifacts are supplied in a public reproducibility repository.</w:t>
+        <w:t>All source code, quantitative inputs, redistributable public-data snapshots, checksum ledgers, and generated analysis artifacts are supplied in a public reproducibility repository.</w:t>
       </w:r>
     </w:p>
     <w:p>

</xml_diff>

<commit_message>
Finalize CRST submission package
Co-Authored-By: Tatsuki Onishi <bougtoir@gmail.com>
</commit_message>
<xml_diff>
--- a/manuscript/build/cover_letter.docx
+++ b/manuscript/build/cover_letter.docx
@@ -19,12 +19,12 @@
     </w:p>
     <w:p>
       <w:r>
-        <w:t>Please consider my manuscript, "Functionally graded roofs for passive snow management: a reduced-order multiobjective modeling study," as a Research Article in Cold Regions Science and Technology.</w:t>
+        <w:t>Please consider my manuscript, "Functionally graded roofs for passive snow management: nominal trade-off expansion limited by constructability and timestep sensitivity," as a Research Article in Cold Regions Science and Technology.</w:t>
       </w:r>
     </w:p>
     <w:p>
       <w:r>
-        <w:t>The manuscript presents a reproducible reduced-order comparison of optimized spatially uniform and functionally graded passive roof-snow strategies. It maps the retained-mass versus discrete-release trade-off, includes geometry and surface ablations, convergence, sensitivity, Monte Carlo perturbation, manufacturing-complexity analysis, and supplementary scenarios from official Japanese weather observations.</w:t>
+        <w:t>The manuscript presents a reproducible reduced-order comparison of optimized spatially uniform and functionally graded passive roof-snow strategies. It maps the retained-mass versus discrete-release trade-off, includes geometry and surface ablations, numerical-resolution checks, sensitivity, Monte Carlo perturbation, manufacturing-complexity analysis, and supplementary scenarios from official Japanese weather observations. Spatial grading produced four nominal intermediate trade-offs absent from the exhaustive uniform grid, but constructability and timestep sensitivity substantially qualify their interpretation.</w:t>
       </w:r>
     </w:p>
     <w:p>

</xml_diff>